<commit_message>
Update documentation deployment URLs
</commit_message>
<xml_diff>
--- a/RecruitFlow-Documentation.docx
+++ b/RecruitFlow-Documentation.docx
@@ -2079,7 +2079,7 @@
     </w:p>
     <w:p>
       <w:r>
-        <w:t>Deploy /RestAPI and /WebClientApplication as separate hosted applications. Use a hosted PostgreSQL database and set:</w:t>
+        <w:t>The production deployment uses the same repository with separate hosted services for the REST API and React web client. The PostgreSQL database is hosted separately and seeded with RestAPI-SQL.sql before testing.</w:t>
       </w:r>
     </w:p>
     <w:p>
@@ -2087,7 +2087,11 @@
         <w:pStyle w:val="ListBullet"/>
       </w:pPr>
       <w:r>
-        <w:t>API: DATABASE_URL, JWT_SECRET, CORS_ORIGIN, PORT</w:t>
+        <w:rPr>
+          <w:rFonts w:ascii="Aptos" w:hAnsi="Aptos"/>
+          <w:sz w:val="21"/>
+        </w:rPr>
+        <w:t>Live web client: https://advanced-web-dev.oliver-f6e.workers.dev</w:t>
       </w:r>
     </w:p>
     <w:p>
@@ -2095,17 +2099,25 @@
         <w:pStyle w:val="ListBullet"/>
       </w:pPr>
       <w:r>
-        <w:t>Client: VITE_API_BASE_URL</w:t>
+        <w:rPr>
+          <w:rFonts w:ascii="Aptos" w:hAnsi="Aptos"/>
+          <w:sz w:val="21"/>
+        </w:rPr>
+        <w:t>Live REST API: https://two30072822-com6023m.onrender.com</w:t>
       </w:r>
     </w:p>
     <w:p>
       <w:r>
-        <w:t>Set CORS_ORIGIN to the deployed frontend URL. Set VITE_API_BASE_URL to the deployed API URL. Run the SQL script once against the hosted database before testing deployed login and CRUD.</w:t>
+        <w:rPr>
+          <w:rFonts w:ascii="Aptos" w:hAnsi="Aptos"/>
+          <w:sz w:val="21"/>
+        </w:rPr>
+        <w:t>API health check: https://two30072822-com6023m.onrender.com/health</w:t>
       </w:r>
     </w:p>
     <w:p>
       <w:r>
-        <w:t>Production build commands:</w:t>
+        <w:t>Production configuration:</w:t>
       </w:r>
     </w:p>
     <w:p>
@@ -2114,11 +2126,7 @@
         <w:ind w:left="259" w:right="115"/>
       </w:pPr>
       <w:r>
-        <w:rPr>
-          <w:rFonts w:ascii="Courier New" w:hAnsi="Courier New"/>
-          <w:sz w:val="17"/>
-        </w:rPr>
-        <w:t>cd RestAPI</w:t>
+        <w:t>Render API root directory: Source Code/RestAPI; build command: npm ci; start command: npm start</w:t>
       </w:r>
     </w:p>
     <w:p>
@@ -2127,11 +2135,7 @@
         <w:ind w:left="259" w:right="115"/>
       </w:pPr>
       <w:r>
-        <w:rPr>
-          <w:rFonts w:ascii="Courier New" w:hAnsi="Courier New"/>
-          <w:sz w:val="17"/>
-        </w:rPr>
-        <w:t>npm start</w:t>
+        <w:t>Cloudflare Workers client root directory: Source Code/WebClientApplication; build command: npm ci &amp;&amp; npm run build; deploy command: npx wrangler deploy</w:t>
       </w:r>
     </w:p>
     <w:p>
@@ -2140,11 +2144,7 @@
         <w:ind w:left="259" w:right="115"/>
       </w:pPr>
       <w:r>
-        <w:rPr>
-          <w:rFonts w:ascii="Courier New" w:hAnsi="Courier New"/>
-          <w:sz w:val="17"/>
-        </w:rPr>
-        <w:t xml:space="preserve"> </w:t>
+        <w:t>API environment variables: DATABASE_URL, JWT_SECRET, CORS_ORIGIN, NODE_ENV=production</w:t>
       </w:r>
     </w:p>
     <w:p>
@@ -2153,11 +2153,7 @@
         <w:ind w:left="259" w:right="115"/>
       </w:pPr>
       <w:r>
-        <w:rPr>
-          <w:rFonts w:ascii="Courier New" w:hAnsi="Courier New"/>
-          <w:sz w:val="17"/>
-        </w:rPr>
-        <w:t>cd WebClientApplication</w:t>
+        <w:t>Client build variable: VITE_API_BASE_URL set to the deployed Render API URL</w:t>
       </w:r>
     </w:p>
     <w:p>
@@ -2166,11 +2162,7 @@
         <w:ind w:left="259" w:right="115"/>
       </w:pPr>
       <w:r>
-        <w:rPr>
-          <w:rFonts w:ascii="Courier New" w:hAnsi="Courier New"/>
-          <w:sz w:val="17"/>
-        </w:rPr>
-        <w:t>npm run build</w:t>
+        <w:t>CORS_ORIGIN is set to the deployed Cloudflare Workers frontend URL. No production database password or JWT secret is stored in the repository.</w:t>
       </w:r>
     </w:p>
     <w:p>
@@ -2178,13 +2170,7 @@
         <w:spacing w:before="60" w:after="60"/>
         <w:ind w:left="259" w:right="115"/>
       </w:pPr>
-      <w:r>
-        <w:rPr>
-          <w:rFonts w:ascii="Courier New" w:hAnsi="Courier New"/>
-          <w:sz w:val="17"/>
-        </w:rPr>
-        <w:t>npm run preview</w:t>
-      </w:r>
+      <w:r/>
     </w:p>
     <w:p>
       <w:pPr>

</xml_diff>

<commit_message>
Add documentation folder structure
</commit_message>
<xml_diff>
--- a/RecruitFlow-Documentation.docx
+++ b/RecruitFlow-Documentation.docx
@@ -1855,6 +1855,101 @@
           <w:szCs w:val="24"/>
         </w:rPr>
         <w:t>The API owns authentication, validation, business rules, SQL queries and protected data access. The client provides a commercial-style recruitment dashboard with protected routes, forms, charts, search, filters, sorting, feedback states and CRUD workflows.</w:t>
+      </w:r>
+    </w:p>
+    <w:p>
+      <w:pPr>
+        <w:pStyle w:val="Heading2"/>
+      </w:pPr>
+      <w:r>
+        <w:t>Folder Structure</w:t>
+      </w:r>
+    </w:p>
+    <w:p>
+      <w:r>
+        <w:t>The submitted project is organised as one repository with separate backend and frontend application folders:</w:t>
+      </w:r>
+    </w:p>
+    <w:p>
+      <w:pPr>
+        <w:spacing w:before="80" w:after="160" w:line="240" w:lineRule="auto"/>
+        <w:shd w:fill="F3F7F6"/>
+      </w:pPr>
+      <w:r>
+        <w:rPr>
+          <w:rFonts w:ascii="Courier New" w:hAnsi="Courier New"/>
+          <w:color w:val="1F2937"/>
+          <w:sz w:val="17"/>
+        </w:rPr>
+        <w:t>230072822-COM6023M/</w:t>
+        <w:br/>
+        <w:t>├── README.md</w:t>
+        <w:br/>
+        <w:t>├── RecruitFlow-Documentation.docx</w:t>
+        <w:br/>
+        <w:t>└── Source Code/</w:t>
+        <w:br/>
+        <w:t xml:space="preserve">    ├── RestAPI-SQL.sql</w:t>
+        <w:br/>
+        <w:t xml:space="preserve">    ├── package.json</w:t>
+        <w:br/>
+        <w:t xml:space="preserve">    ├── RestAPI/</w:t>
+        <w:br/>
+        <w:t xml:space="preserve">    │   ├── package.json</w:t>
+        <w:br/>
+        <w:t xml:space="preserve">    │   ├── README.md</w:t>
+        <w:br/>
+        <w:t xml:space="preserve">    │   ├── tests/</w:t>
+        <w:br/>
+        <w:t xml:space="preserve">    │   └── src/</w:t>
+        <w:br/>
+        <w:t xml:space="preserve">    │       ├── app.js</w:t>
+        <w:br/>
+        <w:t xml:space="preserve">    │       ├── server.js</w:t>
+        <w:br/>
+        <w:t xml:space="preserve">    │       ├── config/</w:t>
+        <w:br/>
+        <w:t xml:space="preserve">    │       ├── db/</w:t>
+        <w:br/>
+        <w:t xml:space="preserve">    │       ├── middleware/</w:t>
+        <w:br/>
+        <w:t xml:space="preserve">    │       ├── routes/</w:t>
+        <w:br/>
+        <w:t xml:space="preserve">    │       ├── services/</w:t>
+        <w:br/>
+        <w:t xml:space="preserve">    │       └── utils/</w:t>
+        <w:br/>
+        <w:t xml:space="preserve">    └── WebClientApplication/</w:t>
+        <w:br/>
+        <w:t xml:space="preserve">        ├── package.json</w:t>
+        <w:br/>
+        <w:t xml:space="preserve">        ├── README.md</w:t>
+        <w:br/>
+        <w:t xml:space="preserve">        ├── wrangler.toml</w:t>
+        <w:br/>
+        <w:t xml:space="preserve">        ├── index.html</w:t>
+        <w:br/>
+        <w:t xml:space="preserve">        └── src/</w:t>
+        <w:br/>
+        <w:t xml:space="preserve">            ├── api/</w:t>
+        <w:br/>
+        <w:t xml:space="preserve">            ├── components/</w:t>
+        <w:br/>
+        <w:t xml:space="preserve">            ├── context/</w:t>
+        <w:br/>
+        <w:t xml:space="preserve">            ├── hooks/</w:t>
+        <w:br/>
+        <w:t xml:space="preserve">            ├── pages/</w:t>
+        <w:br/>
+        <w:t xml:space="preserve">            ├── routes/</w:t>
+        <w:br/>
+        <w:t xml:space="preserve">            ├── schemas/</w:t>
+        <w:br/>
+        <w:t xml:space="preserve">            ├── styles/</w:t>
+        <w:br/>
+        <w:t xml:space="preserve">            ├── types/</w:t>
+        <w:br/>
+        <w:t xml:space="preserve">            └── utils/</w:t>
       </w:r>
     </w:p>
     <w:p>

</xml_diff>